<commit_message>
docs: guia v2 alineada (factura, outlets, inventario unico, clonacion) + ajustes manuales
</commit_message>
<xml_diff>
--- a/Guia_Sistema_Caja_Cigarreria.docx
+++ b/Guia_Sistema_Caja_Cigarreria.docx
@@ -26,7 +26,7 @@
           <w:color w:val="B45309"/>
           <w:sz w:val="26"/>
         </w:rPr>
-        <w:t>Angular 21 + Angular Material (Schematics) + Router Outlet + GitHub</w:t>
+        <w:t>Guía v2 — Angular 21 + Material + Express | Inventario único + Factura + Router</w:t>
       </w:r>
     </w:p>
     <w:p>
@@ -36,9 +36,8 @@
       <w:r>
         <w:rPr>
           <w:i/>
-          <w:sz w:val="22"/>
         </w:rPr>
-        <w:t>Guía universitaria paso a paso — De cero a formulario + tabla visibles en pantalla</w:t>
+        <w:t>Documento alineado al estado actual del repositorio (rama main)</w:t>
       </w:r>
     </w:p>
     <w:p>
@@ -46,7 +45,7 @@
         <w:pStyle w:val="Heading1"/>
       </w:pPr>
       <w:r>
-        <w:t>Ficha técnica del proyecto</w:t>
+        <w:t>Ficha técnica (estado actual)</w:t>
       </w:r>
     </w:p>
     <w:tbl>
@@ -89,28 +88,6 @@
           </w:tcPr>
           <w:p>
             <w:r>
-              <w:t>Proyecto</w:t>
-            </w:r>
-          </w:p>
-        </w:tc>
-        <w:tc>
-          <w:tcPr>
-            <w:tcW w:type="dxa" w:w="4320"/>
-          </w:tcPr>
-          <w:p>
-            <w:r>
-              <w:t>mi-app — Sistema de Caja Registradora (cigarrería / tienda)</w:t>
-            </w:r>
-          </w:p>
-        </w:tc>
-      </w:tr>
-      <w:tr>
-        <w:tc>
-          <w:tcPr>
-            <w:tcW w:type="dxa" w:w="4320"/>
-          </w:tcPr>
-          <w:p>
-            <w:r>
               <w:t>Repositorio</w:t>
             </w:r>
           </w:p>
@@ -133,7 +110,7 @@
           </w:tcPr>
           <w:p>
             <w:r>
-              <w:t>Commit guía</w:t>
+              <w:t>Estructura</w:t>
             </w:r>
           </w:p>
         </w:tc>
@@ -143,7 +120,7 @@
           </w:tcPr>
           <w:p>
             <w:r>
-              <w:t>1f999e9 — feat(caja): formulario address-form + tabla material + router outlet + estilos tienda</w:t>
+              <w:t>mi-app/front/ (Angular) + mi-app/backend/ (Express+TS), carpetas hermanas</w:t>
             </w:r>
           </w:p>
         </w:tc>
@@ -155,7 +132,7 @@
           </w:tcPr>
           <w:p>
             <w:r>
-              <w:t>Stack verificado</w:t>
+              <w:t>Stack</w:t>
             </w:r>
           </w:p>
         </w:tc>
@@ -165,7 +142,7 @@
           </w:tcPr>
           <w:p>
             <w:r>
-              <w:t>Node v24.11.1 | npm 11.6.2 | Angular CLI 21.2.24 | @angular/material 21.2.14</w:t>
+              <w:t>Node 24 + Angular CLI 21 + @angular/material 21 + qrcode | Express 4 + pg + cors + dotenv</w:t>
             </w:r>
           </w:p>
         </w:tc>
@@ -177,7 +154,7 @@
           </w:tcPr>
           <w:p>
             <w:r>
-              <w:t>Ruta local</w:t>
+              <w:t>Rutas front</w:t>
             </w:r>
           </w:p>
         </w:tc>
@@ -187,7 +164,7 @@
           </w:tcPr>
           <w:p>
             <w:r>
-              <w:t>C:\Users\sf467\Documents\Angular proyecto\mi-app</w:t>
+              <w:t>/inventario (CRUD) · /factura (venta) · /tabla (lectura) · redirect a /inventario</w:t>
             </w:r>
           </w:p>
         </w:tc>
@@ -199,7 +176,7 @@
           </w:tcPr>
           <w:p>
             <w:r>
-              <w:t>Punto de partida</w:t>
+              <w:t>Inventario único</w:t>
             </w:r>
           </w:p>
         </w:tc>
@@ -209,7 +186,7 @@
           </w:tcPr>
           <w:p>
             <w:r>
-              <w:t>src/app/app.html borrado (vacío) — front eliminado a propósito para reconstruir con schematics</w:t>
+              <w:t>Servicio Productos (BehaviorSubject + localStorage): lo usan los 3 componentes</w:t>
             </w:r>
           </w:p>
         </w:tc>
@@ -221,7 +198,7 @@
           </w:tcPr>
           <w:p>
             <w:r>
-              <w:t>Resultado</w:t>
+              <w:t>Back-end</w:t>
             </w:r>
           </w:p>
         </w:tc>
@@ -231,7 +208,29 @@
           </w:tcPr>
           <w:p>
             <w:r>
-              <w:t>http://localhost:4200/formulario (address-form) y /tabla (material-table) con estilos de tienda</w:t>
+              <w:t>GET /getproductos · POST /postproductos · DELETE /deleteproductos/:codigo · GET /salud en :3000</w:t>
+            </w:r>
+          </w:p>
+        </w:tc>
+      </w:tr>
+      <w:tr>
+        <w:tc>
+          <w:tcPr>
+            <w:tcW w:type="dxa" w:w="4320"/>
+          </w:tcPr>
+          <w:p>
+            <w:r>
+              <w:t>Puertos</w:t>
+            </w:r>
+          </w:p>
+        </w:tc>
+        <w:tc>
+          <w:tcPr>
+            <w:tcW w:type="dxa" w:w="4320"/>
+          </w:tcPr>
+          <w:p>
+            <w:r>
+              <w:t>Front http://localhost:4200 · Back http://localhost:3000</w:t>
             </w:r>
           </w:p>
         </w:tc>
@@ -243,140 +242,12 @@
         <w:pStyle w:val="Heading1"/>
       </w:pPr>
       <w:r>
-        <w:t>1. Objetivo de aprendizaje</w:t>
+        <w:t>1. Estructura del proyecto: front/ y backend/ hermanos</w:t>
       </w:r>
     </w:p>
     <w:p>
       <w:r>
-        <w:t>Al terminar esta guía el estudiante será capaz de: (1) ejecutar un proyecto Angular con ng serve, (2) instalar y usar schematics reales de Angular Material —enfatizando la línea del address-form—, (3) exponer el schematic generado a través de RouterOutlet, (4) aplicar una hoja de estilos CSS con identidad de caja registradora, y (5) versionar y publicar el avance en GitHub para continuar en cualquier computador.</w:t>
-      </w:r>
-    </w:p>
-    <w:p>
-      <w:pPr>
-        <w:pStyle w:val="ListBullet"/>
-      </w:pPr>
-      <w:r>
-        <w:rPr>
-          <w:b/>
-        </w:rPr>
-        <w:t xml:space="preserve">ng generate my-schematic-collection:my-schematic-name es un ejemplo de la documentación, no un paquete descargable. </w:t>
-      </w:r>
-      <w:r>
-        <w:t xml:space="preserve">Comprender que </w:t>
-      </w:r>
-    </w:p>
-    <w:p>
-      <w:pPr>
-        <w:pStyle w:val="ListBullet"/>
-      </w:pPr>
-      <w:r>
-        <w:rPr>
-          <w:b/>
-        </w:rPr>
-        <w:t>generar con schematic → enrutar → estilizar → compilar → commitear → pushear.</w:t>
-      </w:r>
-      <w:r>
-        <w:t xml:space="preserve">Dominar el flujo profesional: </w:t>
-      </w:r>
-    </w:p>
-    <w:p>
-      <w:pPr>
-        <w:pStyle w:val="ListBullet"/>
-      </w:pPr>
-      <w:r>
-        <w:rPr>
-          <w:b/>
-        </w:rPr>
-        <w:t>código limpio, commits semánticos y app compilando sin errores.</w:t>
-      </w:r>
-      <w:r>
-        <w:t xml:space="preserve">Dejar evidencia universitaria: </w:t>
-      </w:r>
-    </w:p>
-    <w:p>
-      <w:pPr>
-        <w:pStyle w:val="Heading1"/>
-      </w:pPr>
-      <w:r>
-        <w:t>2. Marco conceptual (nivel universitario)</w:t>
-      </w:r>
-    </w:p>
-    <w:p>
-      <w:pPr>
-        <w:pStyle w:val="Heading2"/>
-      </w:pPr>
-      <w:r>
-        <w:t>2.1 ¿Qué es un Schematic?</w:t>
-      </w:r>
-    </w:p>
-    <w:p>
-      <w:r>
-        <w:t>Un schematic es una plantilla de código ejecutable: recibe parámetros (nombre, ruta) y genera/transforma archivos siguiendo reglas (rules, templates, collection.json). Angular CLI los usa para no escribir boilerplate a mano. Una colección (collection.json) agrupa varios schematics: la colección @angular/material incluye address-form, table, navigation, dashboard, tree.</w:t>
-      </w:r>
-    </w:p>
-    <w:p>
-      <w:pPr>
-        <w:pStyle w:val="Heading2"/>
-      </w:pPr>
-      <w:r>
-        <w:t>2.2 Address-form vs Table</w:t>
-      </w:r>
-    </w:p>
-    <w:p>
-      <w:pPr>
-        <w:pStyle w:val="ListBullet"/>
-      </w:pPr>
-      <w:r>
-        <w:rPr>
-          <w:b/>
-        </w:rPr>
-        <w:t>formulario reactivo (ReactiveForms + FormBuilder + Validators) con MatCard, MatInput, MatSelect, MatRadio, MatButton. Ideal para capturar datos (cliente, producto, venta).</w:t>
-      </w:r>
-      <w:r>
-        <w:t xml:space="preserve">address-form: </w:t>
-      </w:r>
-    </w:p>
-    <w:p>
-      <w:pPr>
-        <w:pStyle w:val="ListBullet"/>
-      </w:pPr>
-      <w:r>
-        <w:rPr>
-          <w:b/>
-        </w:rPr>
-        <w:t>tabla con MatTable + MatPaginator + MatSort + DataSource. Ideal para listar productos, ventas del día, inventario.</w:t>
-      </w:r>
-      <w:r>
-        <w:t xml:space="preserve">table: </w:t>
-      </w:r>
-    </w:p>
-    <w:p>
-      <w:pPr>
-        <w:pStyle w:val="Heading2"/>
-      </w:pPr>
-      <w:r>
-        <w:t>2.3 RouterOutlet</w:t>
-      </w:r>
-    </w:p>
-    <w:p>
-      <w:r>
-        <w:t>RouterOutlet es el marcador &lt;router-outlet&gt; donde el Router de Angular inyecta el componente de la ruta activa. Sin él, aunque el schematic exista, no se ve. El flujo es: URL → routes[] → component → render dentro del outlet. Los enlaces routerLink cambian la URL sin recargar.</w:t>
-      </w:r>
-    </w:p>
-    <w:p>
-      <w:pPr>
-        <w:pStyle w:val="Heading1"/>
-      </w:pPr>
-      <w:r>
-        <w:t>3. Preparación del entorno y ng serve</w:t>
-      </w:r>
-    </w:p>
-    <w:p>
-      <w:pPr>
-        <w:pStyle w:val="ListNumber"/>
-      </w:pPr>
-      <w:r>
-        <w:t>Abrir terminal en VS Code (Terminal &gt; New Terminal). Si usa PowerShell y ve el error npm.ps1 / ejecución de scripts deshabilitada, es la ExecutionPolicy de Windows, no de Angular.</w:t>
+        <w:t>El repositorio tiene dos aplicaciones separadas al mismo nivel, como piden los apuntes (back por fuera del front):</w:t>
       </w:r>
     </w:p>
     <w:p>
@@ -389,19 +260,70 @@
           <w:rFonts w:ascii="Consolas" w:hAnsi="Consolas"/>
           <w:sz w:val="19"/>
         </w:rPr>
-        <w:t>Set-ExecutionPolicy -ExecutionPolicy RemoteSigned -Scope CurrentUser</w:t>
+        <w:t>mi-app/</w:t>
         <w:br/>
-        <w:t># confirmar con S/Y, luego verificar:</w:t>
+        <w:t xml:space="preserve">  front/    ← Angular: angular.json, package.json, src/, public/</w:t>
         <w:br/>
-        <w:t>Get-ExecutionPolicy -Scope CurrentUser   # debe decir RemoteSigned</w:t>
+        <w:t xml:space="preserve">  backend/  ← Express+TS: package.json, tsconfig.json, src/{server,app,config,models,controllers,routes}</w:t>
+        <w:br/>
+        <w:t xml:space="preserve">  README.md · .gitignore · Guia_Sistema_Caja_Cigarreria.docx</w:t>
       </w:r>
     </w:p>
     <w:p>
       <w:pPr>
-        <w:pStyle w:val="ListNumber"/>
+        <w:pStyle w:val="ListBullet"/>
       </w:pPr>
       <w:r>
-        <w:t>Ir al proyecto (las comillas son obligatorias por el espacio en “Angular proyecto”):</w:t>
+        <w:rPr>
+          <w:b/>
+        </w:rPr>
+        <w:t>ng serve SOLO funciona dentro de front/.</w:t>
+      </w:r>
+      <w:r>
+        <w:t xml:space="preserve">El workspace Angular vive en front/ (ahí está angular.json). </w:t>
+      </w:r>
+    </w:p>
+    <w:p>
+      <w:pPr>
+        <w:pStyle w:val="ListBullet"/>
+      </w:pPr>
+      <w:r>
+        <w:t xml:space="preserve">El back vive en backend/ con su propio package.json y tsconfig.json. </w:t>
+      </w:r>
+    </w:p>
+    <w:p>
+      <w:pPr>
+        <w:pStyle w:val="ListBullet"/>
+      </w:pPr>
+      <w:r>
+        <w:rPr>
+          <w:b/>
+        </w:rPr>
+        <w:t>la mudanza se hizo con git mv (renombres al 100%).</w:t>
+      </w:r>
+      <w:r>
+        <w:t xml:space="preserve">Historial conservado: </w:t>
+      </w:r>
+    </w:p>
+    <w:p>
+      <w:pPr>
+        <w:pStyle w:val="Heading1"/>
+      </w:pPr>
+      <w:r>
+        <w:t>2. Router y RouterOutlet (cómo se muestra cada pantalla)</w:t>
+      </w:r>
+    </w:p>
+    <w:p>
+      <w:r>
+        <w:t>El Router decide qué componente se pinta según la URL, y &lt;router-outlet&gt; es el hueco donde se inyecta. Tres piezas:</w:t>
+      </w:r>
+    </w:p>
+    <w:p>
+      <w:pPr>
+        <w:pStyle w:val="Heading2"/>
+      </w:pPr>
+      <w:r>
+        <w:t>2.1 front/src/app/app.routes.ts — el mapa</w:t>
       </w:r>
     </w:p>
     <w:p>
@@ -414,25 +336,50 @@
           <w:rFonts w:ascii="Consolas" w:hAnsi="Consolas"/>
           <w:sz w:val="19"/>
         </w:rPr>
-        <w:t>cd "C:\Users\sf467\Documents\Angular proyecto\mi-app"</w:t>
+        <w:t>import { Inventario } from './caja/components/inventario/inventario';</w:t>
         <w:br/>
-        <w:t>dir   # debe mostrar angular.json, package.json, src</w:t>
+        <w:t>import { FacturaCaja } from './caja/components/factura/factura';</w:t>
+        <w:br/>
+        <w:t>import { TablaProductosComponent } from './caja/components/tabla-productos/tabla-productos.component';</w:t>
+        <w:br/>
+        <w:br/>
+        <w:t>export const routes: Routes = [</w:t>
+        <w:br/>
+        <w:t xml:space="preserve">  { path: '', redirectTo: 'inventario', pathMatch: 'full' },</w:t>
+        <w:br/>
+        <w:t xml:space="preserve">  { path: 'inventario', component: Inventario },</w:t>
+        <w:br/>
+        <w:t xml:space="preserve">  { path: 'factura', component: FacturaCaja },</w:t>
+        <w:br/>
+        <w:t xml:space="preserve">  { path: 'tabla', component: TablaProductosComponent },</w:t>
+        <w:br/>
+        <w:t>];</w:t>
+      </w:r>
+    </w:p>
+    <w:p>
+      <w:r>
+        <w:t>Cada objeto path→component es una regla. La ruta vacía redirige a /inventario para que siempre haya algo visible.</w:t>
       </w:r>
     </w:p>
     <w:p>
       <w:pPr>
-        <w:pStyle w:val="ListNumber"/>
+        <w:pStyle w:val="Heading2"/>
       </w:pPr>
       <w:r>
-        <w:t>Instalar dependencias solo si falta node_modules (en este proyecto ya estaba): npm install</w:t>
+        <w:t>2.2 front/src/app/app.ts — el puente</w:t>
+      </w:r>
+    </w:p>
+    <w:p>
+      <w:r>
+        <w:t>App es standalone (sin NgModule) e importa RouterOutlet, RouterLink y RouterLinkActive para usarlos en el HTML.</w:t>
       </w:r>
     </w:p>
     <w:p>
       <w:pPr>
-        <w:pStyle w:val="ListNumber"/>
+        <w:pStyle w:val="Heading2"/>
       </w:pPr>
       <w:r>
-        <w:t>Ejecutar en PowerShell (usar .cmd por el punto anterior):</w:t>
+        <w:t>2.3 front/src/app/app.html — el escenario</w:t>
       </w:r>
     </w:p>
     <w:p>
@@ -445,27 +392,22 @@
           <w:rFonts w:ascii="Consolas" w:hAnsi="Consolas"/>
           <w:sz w:val="19"/>
         </w:rPr>
-        <w:t>npm.cmd start      # equivale a ng serve</w:t>
+        <w:t>&lt;nav class="nav-links"&gt;</w:t>
         <w:br/>
-        <w:t># o:</w:t>
+        <w:t xml:space="preserve">  &lt;a routerLink="/inventario"&gt;Inventario&lt;/a&gt;</w:t>
         <w:br/>
-        <w:t>ng.cmd serve --open</w:t>
+        <w:t xml:space="preserve">  &lt;a routerLink="/factura"&gt;Factura&lt;/a&gt;</w:t>
+        <w:br/>
+        <w:t xml:space="preserve">  &lt;a routerLink="/tabla"&gt;Tabla Productos&lt;/a&gt;</w:t>
+        <w:br/>
+        <w:t>&lt;/nav&gt;</w:t>
+        <w:br/>
+        <w:t>&lt;main class="content"&gt;&lt;router-outlet&gt;&lt;/router-outlet&gt;&lt;/main&gt;</w:t>
       </w:r>
     </w:p>
     <w:p>
-      <w:pPr>
-        <w:pStyle w:val="ListNumber"/>
-      </w:pPr>
       <w:r>
-        <w:t>Esperar “Application bundle generation complete” y abrir http://localhost:4200/. Detener con Ctrl+C.</w:t>
-      </w:r>
-    </w:p>
-    <w:p>
-      <w:pPr>
-        <w:pStyle w:val="IntenseQuote"/>
-      </w:pPr>
-      <w:r>
-        <w:t>Verificación de la guía: Node v24.11.1, npm 11.6.2, Angular CLI 21.2.24. El script start = ng serve (package.json).</w:t>
+        <w:t>routerLink cambia la ruta sin recargar la página; routerLinkActive marca el botón activo; el outlet pinta el componente de la ruta. (El footer antiguo ya fue eliminado: no existe en ningún HTML.)</w:t>
       </w:r>
     </w:p>
     <w:p>
@@ -473,57 +415,12 @@
         <w:pStyle w:val="Heading1"/>
       </w:pPr>
       <w:r>
-        <w:t>4. LA LÍNEA DEL ADDRESS-FORM EN EL CMD (núcleo pedido)</w:t>
+        <w:t>3. Inventario único (una sola fuente para los 3 componentes)</w:t>
       </w:r>
     </w:p>
     <w:p>
-      <w:pPr>
-        <w:pStyle w:val="IntenseQuote"/>
-      </w:pPr>
       <w:r>
-        <w:t>Este es el paso que pidió recalcar. Léalo en clase línea por línea:</w:t>
-      </w:r>
-    </w:p>
-    <w:p>
-      <w:pPr>
-        <w:pStyle w:val="ListNumber"/>
-      </w:pPr>
-      <w:r>
-        <w:t>Entrar a la carpeta del proyecto (components se crea solo, no la cree a mano):</w:t>
-      </w:r>
-    </w:p>
-    <w:p>
-      <w:pPr>
-        <w:ind w:left="288"/>
-        <w:shd w:val="clear" w:color="auto" w:fill="F1F5F9"/>
-      </w:pPr>
-      <w:r>
-        <w:rPr>
-          <w:rFonts w:ascii="Consolas" w:hAnsi="Consolas"/>
-          <w:sz w:val="19"/>
-        </w:rPr>
-        <w:t>cd "C:\Users\sf467\Documents\Angular proyecto\mi-app"</w:t>
-      </w:r>
-    </w:p>
-    <w:p>
-      <w:pPr>
-        <w:pStyle w:val="ListNumber"/>
-      </w:pPr>
-      <w:r>
-        <w:t>Instalar los schematics de Angular Material (una sola vez por proyecto). Esta es la “descarga del schematic”:</w:t>
-      </w:r>
-    </w:p>
-    <w:p>
-      <w:pPr>
-        <w:ind w:left="288"/>
-        <w:shd w:val="clear" w:color="auto" w:fill="F1F5F9"/>
-      </w:pPr>
-      <w:r>
-        <w:rPr>
-          <w:rFonts w:ascii="Consolas" w:hAnsi="Consolas"/>
-          <w:sz w:val="19"/>
-        </w:rPr>
-        <w:t>npx ng add @angular/material --skip-confirmation --theme=azure-blue --typography=true --animations=true</w:t>
+        <w:t>Antes cada vista tenía sus datos (la tabla traía químicos de ejemplo). Ahora el servicio front/src/app/caja/services/productos.ts es la única fuente: BehaviorSubject + localStorage (clave caja_productos_cigarreria) + semilla de 6 productos reales.</w:t>
       </w:r>
     </w:p>
     <w:p>
@@ -534,31 +431,10 @@
         <w:rPr>
           <w:b/>
         </w:rPr>
-        <w:t>descarga @angular/material@21.2.14, crea src/material-theme.scss, actualiza angular.json y src/index.html.</w:t>
+        <w:t>CRUD — crear, editar, buscar y eliminar. Todo cambio pasa por crear()/actualizar()/eliminar().</w:t>
       </w:r>
       <w:r>
-        <w:t xml:space="preserve">Qué hace: </w:t>
-      </w:r>
-    </w:p>
-    <w:p>
-      <w:pPr>
-        <w:pStyle w:val="ListNumber"/>
-      </w:pPr>
-      <w:r>
-        <w:t>Buscar/usar la línea del address-form (schematics Angular Material). Genera el FORMULARIO dentro de components:</w:t>
-      </w:r>
-    </w:p>
-    <w:p>
-      <w:pPr>
-        <w:ind w:left="288"/>
-        <w:shd w:val="clear" w:color="auto" w:fill="F1F5F9"/>
-      </w:pPr>
-      <w:r>
-        <w:rPr>
-          <w:rFonts w:ascii="Consolas" w:hAnsi="Consolas"/>
-          <w:sz w:val="19"/>
-        </w:rPr>
-        <w:t>npx ng generate @angular/material:address-form caja/components/formulario-caja</w:t>
+        <w:t xml:space="preserve">Inventario (/inventario): </w:t>
       </w:r>
     </w:p>
     <w:p>
@@ -569,10 +445,10 @@
         <w:rPr>
           <w:b/>
         </w:rPr>
-        <w:t>npx ng generate = ejecutor | @angular/material = colección | :address-form = schematic | caja/components/formulario-caja = ruta + nombre.</w:t>
+        <w:t>lee el catálogo con listar() y al confirmar llama descontar() — el stock baja en todas las vistas.</w:t>
       </w:r>
       <w:r>
-        <w:t xml:space="preserve">Desglose para exponer en clase: </w:t>
+        <w:t xml:space="preserve">Factura (/factura): </w:t>
       </w:r>
     </w:p>
     <w:p>
@@ -583,10 +459,31 @@
         <w:rPr>
           <w:b/>
         </w:rPr>
-        <w:t>formulario-caja.component.ts (FormularioCajaComponent + FormBuilder), .html (el form), .css ( complementamos), .spec.ts (prueba).</w:t>
+        <w:t>suscrita a productos$ con MatTableDataSource — refleja ediciones y ventas al instante, con filtro, orden y paginación.</w:t>
       </w:r>
       <w:r>
-        <w:t xml:space="preserve">Archivos creados: </w:t>
+        <w:t xml:space="preserve">Tabla (/tabla): </w:t>
+      </w:r>
+    </w:p>
+    <w:p>
+      <w:pPr>
+        <w:pStyle w:val="IntenseQuote"/>
+      </w:pPr>
+      <w:r>
+        <w:t>Prueba cruzada para clase: agregue un producto en Inventario → aparece en Factura y Tabla; venda en Factura → baja el stock en las otras dos.</w:t>
+      </w:r>
+    </w:p>
+    <w:p>
+      <w:pPr>
+        <w:pStyle w:val="Heading1"/>
+      </w:pPr>
+      <w:r>
+        <w:t>4. Factura de venta (el formulario contextual)</w:t>
+      </w:r>
+    </w:p>
+    <w:p>
+      <w:r>
+        <w:t>El address-form genérico se eliminó; en su lugar el componente FacturaCaja (factura.ts/html/css) implementa la compra real en 4 pasos:</w:t>
       </w:r>
     </w:p>
     <w:p>
@@ -594,20 +491,23 @@
         <w:pStyle w:val="ListNumber"/>
       </w:pPr>
       <w:r>
-        <w:t>Generar la TABLA de productos (opción tabla pedida):</w:t>
+        <w:t>Cliente: nombre (obligatorio) + documento (1–10 caracteres) + descuento % (0–100).</w:t>
       </w:r>
     </w:p>
     <w:p>
       <w:pPr>
-        <w:ind w:left="288"/>
-        <w:shd w:val="clear" w:color="auto" w:fill="F1F5F9"/>
+        <w:pStyle w:val="ListNumber"/>
       </w:pPr>
       <w:r>
-        <w:rPr>
-          <w:rFonts w:ascii="Consolas" w:hAnsi="Consolas"/>
-          <w:sz w:val="19"/>
-        </w:rPr>
-        <w:t>npx ng generate @angular/material:table caja/components/tabla-productos</w:t>
+        <w:t>Productos: select del inventario único + cantidad → Agregar. Valida stock (no deja pedir más de lo disponible) y acumula líneas repetidas. Carrito en tabla con quitar por línea, subtotal y total.</w:t>
+      </w:r>
+    </w:p>
+    <w:p>
+      <w:pPr>
+        <w:pStyle w:val="ListNumber"/>
+      </w:pPr>
+      <w:r>
+        <w:t>Medio de pago, cada uno con requerimientos distintos:</w:t>
       </w:r>
     </w:p>
     <w:p>
@@ -618,18 +518,46 @@
         <w:rPr>
           <w:b/>
         </w:rPr>
-        <w:t>tabla-productos.component.ts, .html, .css + tabla-productos-datasource.ts (datos id/name).</w:t>
+        <w:t>pide valor recibido y calcula el cambio; no confirma si no cubre el total.</w:t>
       </w:r>
       <w:r>
-        <w:t xml:space="preserve">Archivos creados: </w:t>
+        <w:t xml:space="preserve">Efectivo: </w:t>
       </w:r>
     </w:p>
     <w:p>
       <w:pPr>
-        <w:pStyle w:val="IntenseQuote"/>
+        <w:pStyle w:val="ListBullet"/>
       </w:pPr>
       <w:r>
-        <w:t>Si ejecuta ng generate --help verá todos los schematics disponibles. El flag --dry-run muestra lo que haría sin crear nada: npx ng g @angular/material:address-form caja/components/prueba --dry-run.</w:t>
+        <w:rPr>
+          <w:b/>
+        </w:rPr>
+        <w:t>exige 16 dígitos, titular y CVV de 3–4.</w:t>
+      </w:r>
+      <w:r>
+        <w:t xml:space="preserve">Tarjeta: </w:t>
+      </w:r>
+    </w:p>
+    <w:p>
+      <w:pPr>
+        <w:pStyle w:val="ListBullet"/>
+      </w:pPr>
+      <w:r>
+        <w:rPr>
+          <w:b/>
+        </w:rPr>
+        <w:t>genera un QR real (librería qrcode) con la billetera y el número demo de la tienda, muestra el número y exige la referencia de aprobación (mín. 6 caracteres).</w:t>
+      </w:r>
+      <w:r>
+        <w:t xml:space="preserve">Nequi / Daviplata: </w:t>
+      </w:r>
+    </w:p>
+    <w:p>
+      <w:pPr>
+        <w:pStyle w:val="ListNumber"/>
+      </w:pPr>
+      <w:r>
+        <w:t>Confirmar venta: valida todo, emite factura FAC-00001 consecutiva (localStorage caja_factura_seq) con ticket verde y descuenta el stock del inventario único.</w:t>
       </w:r>
     </w:p>
     <w:p>
@@ -637,124 +565,12 @@
         <w:pStyle w:val="Heading1"/>
       </w:pPr>
       <w:r>
-        <w:t>5. AGREGAR EL COMPONENTE AL ROUTER-OUTLET (paso a paso recalcado)</w:t>
+        <w:t>5. Back-end (resumen según apuntes)</w:t>
       </w:r>
     </w:p>
     <w:p>
       <w:r>
-        <w:t>Problema inicial: src/app/app.html estaba vacío (front borrado) y src/app/app.routes.ts era routes = []. Aunque los schematics existían, nada se mostraba. Solución en 3 archivos:</w:t>
-      </w:r>
-    </w:p>
-    <w:p>
-      <w:pPr>
-        <w:pStyle w:val="Heading2"/>
-      </w:pPr>
-      <w:r>
-        <w:t>5.1 Archivo 1 — src/app/app.routes.ts (el mapa)</w:t>
-      </w:r>
-    </w:p>
-    <w:p>
-      <w:pPr>
-        <w:ind w:left="288"/>
-        <w:shd w:val="clear" w:color="auto" w:fill="F1F5F9"/>
-      </w:pPr>
-      <w:r>
-        <w:rPr>
-          <w:rFonts w:ascii="Consolas" w:hAnsi="Consolas"/>
-          <w:sz w:val="19"/>
-        </w:rPr>
-        <w:t>import { Routes } from '@angular/router';</w:t>
-        <w:br/>
-        <w:t>import { FormularioCajaComponent } from './caja/components/formulario-caja/formulario-caja.component';</w:t>
-        <w:br/>
-        <w:t>import { TablaProductosComponent } from './caja/components/tabla-productos/tabla-productos.component';</w:t>
-        <w:br/>
-        <w:br/>
-        <w:t>export const routes: Routes = [</w:t>
-        <w:br/>
-        <w:t xml:space="preserve">  { path: '', redirectTo: 'formulario', pathMatch: 'full' },</w:t>
-        <w:br/>
-        <w:t xml:space="preserve">  { path: 'formulario', component: FormularioCajaComponent },</w:t>
-        <w:br/>
-        <w:t xml:space="preserve">  { path: 'tabla', component: TablaProductosComponent },</w:t>
-        <w:br/>
-        <w:t>];</w:t>
-      </w:r>
-    </w:p>
-    <w:p>
-      <w:r>
-        <w:t>Explicación: cada objeto path→component es una regla. La ruta vacía redirige a /formulario para que al abrir localhost:4200 siempre haya algo visible.</w:t>
-      </w:r>
-    </w:p>
-    <w:p>
-      <w:pPr>
-        <w:pStyle w:val="Heading2"/>
-      </w:pPr>
-      <w:r>
-        <w:t>5.2 Archivo 2 — src/app/app.ts (el puente)</w:t>
-      </w:r>
-    </w:p>
-    <w:p>
-      <w:pPr>
-        <w:ind w:left="288"/>
-        <w:shd w:val="clear" w:color="auto" w:fill="F1F5F9"/>
-      </w:pPr>
-      <w:r>
-        <w:rPr>
-          <w:rFonts w:ascii="Consolas" w:hAnsi="Consolas"/>
-          <w:sz w:val="19"/>
-        </w:rPr>
-        <w:t>import { RouterLink, RouterLinkActive, RouterOutlet } from '@angular/router';</w:t>
-        <w:br/>
-        <w:t>@Component({ selector: 'app-root', imports: [RouterOutlet, RouterLink, RouterLinkActive], ... })</w:t>
-      </w:r>
-    </w:p>
-    <w:p>
-      <w:r>
-        <w:t>Explicación: App es standalone (sin NgModule). Debe importar RouterOutlet para usar &lt;router-outlet&gt;, y RouterLink/RouterLinkActive para los botones de navegación.</w:t>
-      </w:r>
-    </w:p>
-    <w:p>
-      <w:pPr>
-        <w:pStyle w:val="Heading2"/>
-      </w:pPr>
-      <w:r>
-        <w:t>5.3 Archivo 3 — src/app/app.html (el escenario)</w:t>
-      </w:r>
-    </w:p>
-    <w:p>
-      <w:pPr>
-        <w:ind w:left="288"/>
-        <w:shd w:val="clear" w:color="auto" w:fill="F1F5F9"/>
-      </w:pPr>
-      <w:r>
-        <w:rPr>
-          <w:rFonts w:ascii="Consolas" w:hAnsi="Consolas"/>
-          <w:sz w:val="19"/>
-        </w:rPr>
-        <w:t>&lt;header class="topbar"&gt;...&lt;a routerLink="/formulario"&gt;Formulario&lt;/a&gt;&lt;a routerLink="/tabla"&gt;Tabla Productos&lt;/a&gt;...&lt;/header&gt;</w:t>
-        <w:br/>
-        <w:t>&lt;h1&gt;Sistema de Caja - Tienda / Cigarrería&lt;/h1&gt;</w:t>
-        <w:br/>
-        <w:t>&lt;main class="content"&gt;&lt;router-outlet&gt;&lt;/router-outlet&gt;&lt;/main&gt;</w:t>
-      </w:r>
-    </w:p>
-    <w:p>
-      <w:r>
-        <w:t>Explicación: routerLink cambia la ruta sin recargar; routerLinkActive marca el botón activo; &lt;router-outlet&gt; es donde Angular pinta FormularioCajaComponent o TablaProductosComponent según la URL. Verificación en clase: visite /formulario y /tabla y observe el cambio sin reload.</w:t>
-      </w:r>
-    </w:p>
-    <w:p>
-      <w:pPr>
-        <w:pStyle w:val="Heading1"/>
-      </w:pPr>
-      <w:r>
-        <w:t>6. Hoja de estilos CSS — de “muy simple” a identidad de tienda</w:t>
-      </w:r>
-    </w:p>
-    <w:p>
-      <w:r>
-        <w:t>Queja original: “está muy simple”. Se aplicó stylesheet con paleta caja registradora: negro #111827 (mueble de caja) + ámbar #F59E0B (teclas/total) + fondo #F8FAFC (ticket).</w:t>
+        <w:t>Carpeta backend/ en la misma raíz del front pero por fuera de src/. Comandos amarillos del apunte ejecutados: npm init -y · npm install express pg cors dotenv · npm i -D typescript ts-node-dev @types/... · npx tsc --init.</w:t>
       </w:r>
     </w:p>
     <w:tbl>
@@ -774,7 +590,7 @@
           </w:tcPr>
           <w:p>
             <w:r>
-              <w:t>Archivo CSS</w:t>
+              <w:t>Archivo</w:t>
             </w:r>
           </w:p>
         </w:tc>
@@ -784,7 +600,7 @@
           </w:tcPr>
           <w:p>
             <w:r>
-              <w:t>Qué aporta (para sustentar)</w:t>
+              <w:t>Rol (analogía del apunte)</w:t>
             </w:r>
           </w:p>
         </w:tc>
@@ -796,7 +612,7 @@
           </w:tcPr>
           <w:p>
             <w:r>
-              <w:t>src/app/app.css</w:t>
+              <w:t>package.json</w:t>
             </w:r>
           </w:p>
         </w:tc>
@@ -806,7 +622,7 @@
           </w:tcPr>
           <w:p>
             <w:r>
-              <w:t>Layout .topbar (flex, sombra), .brand span ámbar, .nav-links a.active ámbar, .page-header, .content centrado max-width 1100px, .footer.</w:t>
+              <w:t>Inventario de insumos del back (dependencias y scripts dev/build/start).</w:t>
             </w:r>
           </w:p>
         </w:tc>
@@ -818,7 +634,7 @@
           </w:tcPr>
           <w:p>
             <w:r>
-              <w:t>caja/.../formulario-caja.component.css</w:t>
+              <w:t>tsconfig.json</w:t>
             </w:r>
           </w:p>
         </w:tc>
@@ -828,7 +644,7 @@
           </w:tcPr>
           <w:p>
             <w:r>
-              <w:t>Card con border-top ámbar 6px, border-radius 16px, sombra, .row flex con gap, responsive @media 700px a columna, botón submit ancho y negrita.</w:t>
+              <w:t>Reglas TypeScript: qué es válido y qué no.</w:t>
             </w:r>
           </w:p>
         </w:tc>
@@ -840,7 +656,7 @@
           </w:tcPr>
           <w:p>
             <w:r>
-              <w:t>caja/.../tabla-productos.component.css</w:t>
+              <w:t>.env / .env.example</w:t>
             </w:r>
           </w:p>
         </w:tc>
@@ -850,7 +666,7 @@
           </w:tcPr>
           <w:p>
             <w:r>
-              <w:t>Contenedor blanco redondeado con border-top negro, header de tabla negro con texto ámbar en mayúsculas, filas pares #F8FAFC, paginador redondeado.</w:t>
+              <w:t>Secretos locales (DB, puerto). .env NO se sube; .env.example SÍ.</w:t>
             </w:r>
           </w:p>
         </w:tc>
@@ -862,7 +678,7 @@
           </w:tcPr>
           <w:p>
             <w:r>
-              <w:t>src/styles.css</w:t>
+              <w:t>.gitignore</w:t>
             </w:r>
           </w:p>
         </w:tc>
@@ -872,7 +688,7 @@
           </w:tcPr>
           <w:p>
             <w:r>
-              <w:t>Reset global: html/body sin margen, fuente Roboto, fondo claro, box-sizing border-box.</w:t>
+              <w:t>node_modules, dist y .env no se suben.</w:t>
             </w:r>
           </w:p>
         </w:tc>
@@ -884,7 +700,7 @@
           </w:tcPr>
           <w:p>
             <w:r>
-              <w:t>src/material-theme.scss</w:t>
+              <w:t>src/server.ts</w:t>
             </w:r>
           </w:p>
         </w:tc>
@@ -894,7 +710,117 @@
           </w:tcPr>
           <w:p>
             <w:r>
-              <w:t>Tema azure-blue generado por ng add (no editar a mano).</w:t>
+              <w:t>Serve: inicia el localhost:3000.</w:t>
+            </w:r>
+          </w:p>
+        </w:tc>
+      </w:tr>
+      <w:tr>
+        <w:tc>
+          <w:tcPr>
+            <w:tcW w:type="dxa" w:w="4320"/>
+          </w:tcPr>
+          <w:p>
+            <w:r>
+              <w:t>src/app.ts</w:t>
+            </w:r>
+          </w:p>
+        </w:tc>
+        <w:tc>
+          <w:tcPr>
+            <w:tcW w:type="dxa" w:w="4320"/>
+          </w:tcPr>
+          <w:p>
+            <w:r>
+              <w:t>AppConfig: CORS hacia el front + json + rutas.</w:t>
+            </w:r>
+          </w:p>
+        </w:tc>
+      </w:tr>
+      <w:tr>
+        <w:tc>
+          <w:tcPr>
+            <w:tcW w:type="dxa" w:w="4320"/>
+          </w:tcPr>
+          <w:p>
+            <w:r>
+              <w:t>src/config/db.ts</w:t>
+            </w:r>
+          </w:p>
+        </w:tc>
+        <w:tc>
+          <w:tcPr>
+            <w:tcW w:type="dxa" w:w="4320"/>
+          </w:tcPr>
+          <w:p>
+            <w:r>
+              <w:t>Credenciales pg (con modo memoria si no hay DB).</w:t>
+            </w:r>
+          </w:p>
+        </w:tc>
+      </w:tr>
+      <w:tr>
+        <w:tc>
+          <w:tcPr>
+            <w:tcW w:type="dxa" w:w="4320"/>
+          </w:tcPr>
+          <w:p>
+            <w:r>
+              <w:t>src/models/producto.ts</w:t>
+            </w:r>
+          </w:p>
+        </w:tc>
+        <w:tc>
+          <w:tcPr>
+            <w:tcW w:type="dxa" w:w="4320"/>
+          </w:tcPr>
+          <w:p>
+            <w:r>
+              <w:t>Plantilla que valida los datos.</w:t>
+            </w:r>
+          </w:p>
+        </w:tc>
+      </w:tr>
+      <w:tr>
+        <w:tc>
+          <w:tcPr>
+            <w:tcW w:type="dxa" w:w="4320"/>
+          </w:tcPr>
+          <w:p>
+            <w:r>
+              <w:t>src/controllers/*.ts</w:t>
+            </w:r>
+          </w:p>
+        </w:tc>
+        <w:tc>
+          <w:tcPr>
+            <w:tcW w:type="dxa" w:w="4320"/>
+          </w:tcPr>
+          <w:p>
+            <w:r>
+              <w:t>GET (obtener), POST (tratar), DELETE (eliminar).</w:t>
+            </w:r>
+          </w:p>
+        </w:tc>
+      </w:tr>
+      <w:tr>
+        <w:tc>
+          <w:tcPr>
+            <w:tcW w:type="dxa" w:w="4320"/>
+          </w:tcPr>
+          <w:p>
+            <w:r>
+              <w:t>src/routes/*.ts</w:t>
+            </w:r>
+          </w:p>
+        </w:tc>
+        <w:tc>
+          <w:tcPr>
+            <w:tcW w:type="dxa" w:w="4320"/>
+          </w:tcPr>
+          <w:p>
+            <w:r>
+              <w:t>Menú: /getproductos, /postproductos, /deleteproductos/:codigo.</w:t>
             </w:r>
           </w:p>
         </w:tc>
@@ -905,7 +831,7 @@
         <w:pStyle w:val="IntenseQuote"/>
       </w:pPr>
       <w:r>
-        <w:t>Criterio universitario: estilos por componente (encapsulados) + globales mínimos + tema Material intacto. Contraste AA y responsive móvil incluidos.</w:t>
+        <w:t>dist/ es solo despliegue compilado: no se crea ni se sube (apunte respetado).</w:t>
       </w:r>
     </w:p>
     <w:p>
@@ -913,7 +839,15 @@
         <w:pStyle w:val="Heading1"/>
       </w:pPr>
       <w:r>
-        <w:t>7. Cómo se subió lo nuevo al repositorio (evidencia Git)</w:t>
+        <w:t>6. Clonar el repo en otra máquina y habilitar los servidores</w:t>
+      </w:r>
+    </w:p>
+    <w:p>
+      <w:pPr>
+        <w:pStyle w:val="IntenseQuote"/>
+      </w:pPr>
+      <w:r>
+        <w:t>En la máquina nueva (con Node.js 20+ y Git instalados):</w:t>
       </w:r>
     </w:p>
     <w:p>
@@ -921,7 +855,7 @@
         <w:pStyle w:val="ListNumber"/>
       </w:pPr>
       <w:r>
-        <w:t>Estado previo: rama master, sin remote, 1 commit initial + 1 commit local. Repo GitHub vacío (git ls-remote sin HEAD).</w:t>
+        <w:t>Clonar y entrar:</w:t>
       </w:r>
     </w:p>
     <w:p>
@@ -934,11 +868,9 @@
           <w:rFonts w:ascii="Consolas" w:hAnsi="Consolas"/>
           <w:sz w:val="19"/>
         </w:rPr>
-        <w:t>git remote add origin https://github.com/Santi5253/Angular-proyecto-.git</w:t>
+        <w:t>git clone https://github.com/Santi5253/Angular-proyecto-.git</w:t>
         <w:br/>
-        <w:t>git remote -v</w:t>
-        <w:br/>
-        <w:t>git branch -M main</w:t>
+        <w:t>cd Angular-proyecto-</w:t>
       </w:r>
     </w:p>
     <w:p>
@@ -946,7 +878,26 @@
         <w:pStyle w:val="ListNumber"/>
       </w:pPr>
       <w:r>
-        <w:t>Compilación de verificación antes de subir (obligatorio): npx ng build --configuration development → “Application bundle generation complete”.</w:t>
+        <w:t>Habilitar el FRONT (obligatorio npm install: node_modules no viaja en git):</w:t>
+      </w:r>
+    </w:p>
+    <w:p>
+      <w:pPr>
+        <w:ind w:left="288"/>
+        <w:shd w:val="clear" w:color="auto" w:fill="F1F5F9"/>
+      </w:pPr>
+      <w:r>
+        <w:rPr>
+          <w:rFonts w:ascii="Consolas" w:hAnsi="Consolas"/>
+          <w:sz w:val="19"/>
+        </w:rPr>
+        <w:t>cd mi-app/front</w:t>
+        <w:br/>
+        <w:t>npm install</w:t>
+        <w:br/>
+        <w:t>npm.cmd start</w:t>
+        <w:br/>
+        <w:t># abrir http://localhost:4200/  (en PowerShell usar npm.cmd por la ExecutionPolicy)</w:t>
       </w:r>
     </w:p>
     <w:p>
@@ -954,7 +905,109 @@
         <w:pStyle w:val="ListNumber"/>
       </w:pPr>
       <w:r>
-        <w:t>Commit semántico y push realizados por el asistente:</w:t>
+        <w:t>Habilitar el BACK (terminal aparte):</w:t>
+      </w:r>
+    </w:p>
+    <w:p>
+      <w:pPr>
+        <w:ind w:left="288"/>
+        <w:shd w:val="clear" w:color="auto" w:fill="F1F5F9"/>
+      </w:pPr>
+      <w:r>
+        <w:rPr>
+          <w:rFonts w:ascii="Consolas" w:hAnsi="Consolas"/>
+          <w:sz w:val="19"/>
+        </w:rPr>
+        <w:t>cd mi-app/backend</w:t>
+        <w:br/>
+        <w:t>npm install</w:t>
+        <w:br/>
+        <w:t>cp .env.example .env   # en Windows: copy .env.example .env</w:t>
+        <w:br/>
+        <w:t>npm run dev</w:t>
+        <w:br/>
+        <w:t># verificar http://localhost:3000/salud  → {"ok":true,...}</w:t>
+      </w:r>
+    </w:p>
+    <w:p>
+      <w:pPr>
+        <w:pStyle w:val="ListBullet"/>
+      </w:pPr>
+      <w:r>
+        <w:rPr>
+          <w:b/>
+        </w:rPr>
+        <w:t>ejecutar una vez Set-ExecutionPolicy -ExecutionPolicy RemoteSigned -Scope CurrentUser y usar npm.cmd / ng.cmd.</w:t>
+      </w:r>
+      <w:r>
+        <w:t xml:space="preserve">Si PowerShell bloquea npm (error npm.ps1): </w:t>
+      </w:r>
+    </w:p>
+    <w:p>
+      <w:pPr>
+        <w:pStyle w:val="ListBullet"/>
+      </w:pPr>
+      <w:r>
+        <w:rPr>
+          <w:b/>
+        </w:rPr>
+        <w:t>el back arranca en modo memoria y el front usa localStorage.</w:t>
+      </w:r>
+      <w:r>
+        <w:t xml:space="preserve">Sin base de datos no pasa nada: </w:t>
+      </w:r>
+    </w:p>
+    <w:p>
+      <w:pPr>
+        <w:pStyle w:val="ListBullet"/>
+      </w:pPr>
+      <w:r>
+        <w:rPr>
+          <w:b/>
+        </w:rPr>
+        <w:t>front con ng serve --port 4201; back cambiando PORT en .env.</w:t>
+      </w:r>
+      <w:r>
+        <w:t xml:space="preserve">Puertos ocupados: </w:t>
+      </w:r>
+    </w:p>
+    <w:p>
+      <w:pPr>
+        <w:pStyle w:val="Heading1"/>
+      </w:pPr>
+      <w:r>
+        <w:t>7. Volver a cargar actualizaciones (ciclo diario)</w:t>
+      </w:r>
+    </w:p>
+    <w:p>
+      <w:pPr>
+        <w:pStyle w:val="ListNumber"/>
+      </w:pPr>
+      <w:r>
+        <w:t>Antes de trabajar, traiga lo último:</w:t>
+      </w:r>
+    </w:p>
+    <w:p>
+      <w:pPr>
+        <w:ind w:left="288"/>
+        <w:shd w:val="clear" w:color="auto" w:fill="F1F5F9"/>
+      </w:pPr>
+      <w:r>
+        <w:rPr>
+          <w:rFonts w:ascii="Consolas" w:hAnsi="Consolas"/>
+          <w:sz w:val="19"/>
+        </w:rPr>
+        <w:t>cd "C:\Users\sf467\Documents\Angular proyecto\mi-app"</w:t>
+        <w:br/>
+        <w:t>git pull</w:t>
+      </w:r>
+    </w:p>
+    <w:p>
+      <w:pPr>
+        <w:pStyle w:val="ListNumber"/>
+      </w:pPr>
+      <w:r>
+        <w:t>Trabaje, verifique que compile (front: npx ng build; back: npx tsc --noEmit) y revise qué cambió:</w:t>
       </w:r>
     </w:p>
     <w:p>
@@ -968,46 +1021,6 @@
           <w:sz w:val="19"/>
         </w:rPr>
         <w:t>git status --short</w:t>
-        <w:br/>
-        <w:t>git add .</w:t>
-        <w:br/>
-        <w:t>git commit -m "feat(caja): formulario address-form + tabla material + router outlet + estilos tienda cigarreria"</w:t>
-        <w:br/>
-        <w:t>git log --oneline -4</w:t>
-        <w:br/>
-        <w:t># 1f999e9 feat(caja)... | cf0653a mi primer avance | 2ff8b83 initial commit</w:t>
-        <w:br/>
-        <w:t>git push -u origin main</w:t>
-        <w:br/>
-        <w:t># To https://github.com/Santi5253/Angular-proyecto-.git  cf0653a..1f999e9  main -&gt; main</w:t>
-      </w:r>
-    </w:p>
-    <w:p>
-      <w:pPr>
-        <w:pStyle w:val="ListBullet"/>
-      </w:pPr>
-      <w:r>
-        <w:rPr>
-          <w:b/>
-        </w:rPr>
-        <w:t>angular.json, package.json/lock, src/index.html, app.* (4), styles.css, material-theme.scss, caja/... (9 archivos nuevos). node_modules/dist excluidos por .gitignore.</w:t>
-      </w:r>
-      <w:r>
-        <w:t xml:space="preserve">Archivos subidos (19, +730/-46): </w:t>
-      </w:r>
-    </w:p>
-    <w:p>
-      <w:pPr>
-        <w:pStyle w:val="ListBullet"/>
-      </w:pPr>
-      <w:r>
-        <w:rPr>
-          <w:b/>
-        </w:rPr>
-        <w:t>el primer push pidió login (Password auth no soportada). Se resolvió con Credential Manager / navegador; el segundo push ya pasó directo.</w:t>
-      </w:r>
-      <w:r>
-        <w:t xml:space="preserve">Autenticación: </w:t>
       </w:r>
     </w:p>
     <w:p>
@@ -1015,118 +1028,7 @@
         <w:pStyle w:val="ListNumber"/>
       </w:pPr>
       <w:r>
-        <w:t>Flujo diario desde ahora: git pull → trabajar → git add . → git commit -m “…” → git push. Para otro PC: git clone &lt;url&gt; → cd mi-app → npm install → npm.cmd start.</w:t>
-      </w:r>
-    </w:p>
-    <w:p>
-      <w:pPr>
-        <w:pStyle w:val="Heading1"/>
-      </w:pPr>
-      <w:r>
-        <w:t>8. Verificación para mañana en clase (5 minutos)</w:t>
-      </w:r>
-    </w:p>
-    <w:p>
-      <w:pPr>
-        <w:pStyle w:val="ListNumber"/>
-      </w:pPr>
-      <w:r>
-        <w:t>npm.cmd start y abrir http://localhost:4200 → debe redirigir a /formulario y mostrar el form con borde ámbar.</w:t>
-      </w:r>
-    </w:p>
-    <w:p>
-      <w:pPr>
-        <w:pStyle w:val="ListNumber"/>
-      </w:pPr>
-      <w:r>
-        <w:t>Clic en “Tabla Productos” → URL /tabla, tabla con id/name + paginador. Clic en “Formulario” → vuelve sin recargar (prueba del outlet).</w:t>
-      </w:r>
-    </w:p>
-    <w:p>
-      <w:pPr>
-        <w:pStyle w:val="ListNumber"/>
-      </w:pPr>
-      <w:r>
-        <w:t>Abrir DevTools &gt; Console sin errores rojos; npx ng build ya pasó.</w:t>
-      </w:r>
-    </w:p>
-    <w:p>
-      <w:pPr>
-        <w:pStyle w:val="ListNumber"/>
-      </w:pPr>
-      <w:r>
-        <w:t>En GitHub (rama main) verificar commit 1f999e9 y carpetas src/app/caja/components/...</w:t>
-      </w:r>
-    </w:p>
-    <w:p>
-      <w:pPr>
-        <w:pStyle w:val="Heading1"/>
-      </w:pPr>
-      <w:r>
-        <w:t>9. Trabajo en clase: corregir y avanzar (no está terminado a propósito)</w:t>
-      </w:r>
-    </w:p>
-    <w:p>
-      <w:r>
-        <w:t>El address-form trae datos gringos (Alabama, California, shipping). La corrección que el docente esperará:</w:t>
-      </w:r>
-    </w:p>
-    <w:p>
-      <w:pPr>
-        <w:pStyle w:val="ListBullet"/>
-      </w:pPr>
-      <w:r>
-        <w:rPr>
-          <w:b/>
-        </w:rPr>
-        <w:t>company→producto, firstName/lastName→nombre, address→precio/código, city→stock, state→categoría (cigarrillos, bebidas, dulces), postalCode→código barras, shipping→medio pago (efectivo/tarjeta/nequi).</w:t>
-      </w:r>
-      <w:r>
-        <w:t xml:space="preserve">Renombrar en formulario-caja.component.ts: </w:t>
-      </w:r>
-    </w:p>
-    <w:p>
-      <w:pPr>
-        <w:pStyle w:val="ListBullet"/>
-      </w:pPr>
-      <w:r>
-        <w:rPr>
-          <w:b/>
-        </w:rPr>
-        <w:t>cambiar columnas id/name por codigo/nombre/precio/stock y displayedColumns en el .ts.</w:t>
-      </w:r>
-      <w:r>
-        <w:t xml:space="preserve">En tabla-productos-datasource.ts: </w:t>
-      </w:r>
-    </w:p>
-    <w:p>
-      <w:pPr>
-        <w:pStyle w:val="ListBullet"/>
-      </w:pPr>
-      <w:r>
-        <w:rPr>
-          <w:b/>
-        </w:rPr>
-        <w:t>ng g interface caja/models/producto + ng g service caja/services/ventas, e inyectar el servicio en punto de venta para calcular total.</w:t>
-      </w:r>
-      <w:r>
-        <w:t xml:space="preserve">Ejercicio propuesto: </w:t>
-      </w:r>
-    </w:p>
-    <w:p>
-      <w:pPr>
-        <w:pStyle w:val="IntenseQuote"/>
-      </w:pPr>
-      <w:r>
-        <w:t>Frase para sustentar: “El sistema está basado en schematics: ninguna vista se creó a mano; todas nacieron con ng generate de la colección @angular/material y se exponen por RouterOutlet con estilos propios de caja registradora.”</w:t>
-      </w:r>
-    </w:p>
-    <w:p>
-      <w:pPr>
-        <w:pStyle w:val="Heading1"/>
-      </w:pPr>
-      <w:r>
-        <w:t>Anexo A — Comandos copiables (orden de ejecución)</w:t>
+        <w:t>Suba sus cambios:</w:t>
       </w:r>
     </w:p>
     <w:p>
@@ -1139,7 +1041,47 @@
           <w:rFonts w:ascii="Consolas" w:hAnsi="Consolas"/>
           <w:sz w:val="19"/>
         </w:rPr>
-        <w:t>cd "C:\Users\sf467\Documents\Angular proyecto\mi-app"</w:t>
+        <w:t>git add .</w:t>
+        <w:br/>
+        <w:t>git commit -m "feat(caja): describa lo que hizo"</w:t>
+        <w:br/>
+        <w:t>git push</w:t>
+      </w:r>
+    </w:p>
+    <w:p>
+      <w:pPr>
+        <w:pStyle w:val="ListBullet"/>
+      </w:pPr>
+      <w:r>
+        <w:rPr>
+          <w:b/>
+        </w:rPr>
+        <w:t>pull antes de trabajar, push al terminar. node_modules/, dist/ y .env nunca se suben (los cubren los .gitignore).</w:t>
+      </w:r>
+      <w:r>
+        <w:t xml:space="preserve">Regla de oro: </w:t>
+      </w:r>
+    </w:p>
+    <w:p>
+      <w:pPr>
+        <w:pStyle w:val="ListBullet"/>
+      </w:pPr>
+      <w:r>
+        <w:rPr>
+          <w:b/>
+        </w:rPr>
+        <w:t>solo git pull (y npm install únicamente si cambió algún package.json).</w:t>
+      </w:r>
+      <w:r>
+        <w:t xml:space="preserve">En otra máquina, tras un push: </w:t>
+      </w:r>
+    </w:p>
+    <w:p>
+      <w:pPr>
+        <w:pStyle w:val="Heading1"/>
+      </w:pPr>
+      <w:r>
+        <w:t>Anexo — Comandos copiables</w:t>
       </w:r>
     </w:p>
     <w:p>
@@ -1152,7 +1094,7 @@
           <w:rFonts w:ascii="Consolas" w:hAnsi="Consolas"/>
           <w:sz w:val="19"/>
         </w:rPr>
-        <w:t>npm.cmd start   # o ng.cmd serve --open</w:t>
+        <w:t>cd "C:\Users\sf467\Documents\Angular proyecto\mi-app\front"</w:t>
       </w:r>
     </w:p>
     <w:p>
@@ -1165,7 +1107,7 @@
           <w:rFonts w:ascii="Consolas" w:hAnsi="Consolas"/>
           <w:sz w:val="19"/>
         </w:rPr>
-        <w:t>npx ng add @angular/material --skip-confirmation --theme=azure-blue --typography=true --animations=true</w:t>
+        <w:t>npm.cmd start   # front http://localhost:4200/inventario | /factura | /tabla</w:t>
       </w:r>
     </w:p>
     <w:p>
@@ -1178,7 +1120,7 @@
           <w:rFonts w:ascii="Consolas" w:hAnsi="Consolas"/>
           <w:sz w:val="19"/>
         </w:rPr>
-        <w:t>npx ng generate @angular/material:address-form caja/components/formulario-caja</w:t>
+        <w:t>cd "..\backend"  # o cd "C:\Users\sf467\Documents\Angular proyecto\mi-app\backend"</w:t>
       </w:r>
     </w:p>
     <w:p>
@@ -1191,7 +1133,7 @@
           <w:rFonts w:ascii="Consolas" w:hAnsi="Consolas"/>
           <w:sz w:val="19"/>
         </w:rPr>
-        <w:t>npx ng generate @angular/material:table caja/components/tabla-productos</w:t>
+        <w:t>npm run dev     # back http://localhost:3000/salud</w:t>
       </w:r>
     </w:p>
     <w:p>
@@ -1204,7 +1146,7 @@
           <w:rFonts w:ascii="Consolas" w:hAnsi="Consolas"/>
           <w:sz w:val="19"/>
         </w:rPr>
-        <w:t>npx ng build --configuration development</w:t>
+        <w:t>npx ng generate component caja/components/nombre  # nuevos schematics del front</w:t>
       </w:r>
     </w:p>
     <w:p>
@@ -1217,56 +1159,9 @@
           <w:rFonts w:ascii="Consolas" w:hAnsi="Consolas"/>
           <w:sz w:val="19"/>
         </w:rPr>
-        <w:t>git status --short / git add . / git commit -m "mensaje" / git push</w:t>
+        <w:t>git pull / git add . / git commit -m "mensaje" / git push</w:t>
       </w:r>
     </w:p>
-    <w:p>
-      <w:pPr>
-        <w:ind w:left="288"/>
-        <w:shd w:val="clear" w:color="auto" w:fill="F1F5F9"/>
-      </w:pPr>
-      <w:r>
-        <w:rPr>
-          <w:rFonts w:ascii="Consolas" w:hAnsi="Consolas"/>
-          <w:sz w:val="19"/>
-        </w:rPr>
-        <w:t>git clone https://github.com/Santi5253/Angular-proyecto-.git</w:t>
-      </w:r>
-    </w:p>
-    <w:p>
-      <w:pPr>
-        <w:pStyle w:val="Heading1"/>
-      </w:pPr>
-      <w:r>
-        <w:t>Anexo B — Estructura final de carpetas</w:t>
-      </w:r>
-    </w:p>
-    <w:p>
-      <w:pPr>
-        <w:ind w:left="288"/>
-        <w:shd w:val="clear" w:color="auto" w:fill="F1F5F9"/>
-      </w:pPr>
-      <w:r>
-        <w:rPr>
-          <w:rFonts w:ascii="Consolas" w:hAnsi="Consolas"/>
-          <w:sz w:val="19"/>
-        </w:rPr>
-        <w:t>src/app/</w:t>
-        <w:br/>
-        <w:t xml:space="preserve">  app.ts / app.html / app.css / app.routes.ts / app.config.ts</w:t>
-        <w:br/>
-        <w:t xml:space="preserve">  caja/components/</w:t>
-        <w:br/>
-        <w:t xml:space="preserve">    formulario-caja/ (.ts .html .css .spec.ts)</w:t>
-        <w:br/>
-        <w:t xml:space="preserve">    tabla-productos/ (.ts .html .css .spec.ts + -datasource.ts)</w:t>
-        <w:br/>
-        <w:t>src/material-theme.scss / src/styles.css / src/index.html</w:t>
-        <w:br/>
-        <w:t>angular.json / package.json</w:t>
-      </w:r>
-    </w:p>
-    <w:p/>
     <w:p>
       <w:pPr>
         <w:jc w:val="center"/>
@@ -1275,7 +1170,7 @@
         <w:rPr>
           <w:i/>
         </w:rPr>
-        <w:t>— Fin de la guía — Lleve este documento impreso o en el portátil. En clase: corrija el form a productos reales y sustente con la frase del punto 9. —</w:t>
+        <w:t>— Fin guía v2 — Sintetiza en clase: inventario único, factura con pagos y QR, outlets por ruta, front/back hermanos. —</w:t>
       </w:r>
     </w:p>
     <w:sectPr>

</xml_diff>